<commit_message>
Space above sub-headings after lists/answer boxes in Disclosure Committee Charter (request 1ce50c34)
The amended Word adds 12pt before sub-headings 3.2-3.6 (directly after a
lettered list) and Schedule 3's items 2-5 (directly after an answer box);
nothing else differs beyond Word re-save noise. Adds an opt-in registry
switch `subhead_gap` (points) that does this for a short numbered
sub-heading following a list or table, in both the PDF and the Word
export, and turns it on for this policy only — no other document changes.

Co-Authored-By: Claude Sonnet 5.5 <noreply@anthropic.com>
Claude-Session: https://claude.ai/code/session_01VUsjveqB5rJTNZAuQyZqE6
</commit_message>
<xml_diff>
--- a/docs/files/Disclosure_Committee_Charter__Policy_2026-05.docx
+++ b/docs/files/Disclosure_Committee_Charter__Policy_2026-05.docx
@@ -19,7 +19,7 @@
               <a:graphicData uri="http://schemas.openxmlformats.org/drawingml/2006/picture">
                 <pic:pic>
                   <pic:nvPicPr>
-                    <pic:cNvPr id="0" name="tmpmljqz0c5.png"/>
+                    <pic:cNvPr id="0" name="tmpfwu_96so.png"/>
                     <pic:cNvPicPr/>
                   </pic:nvPicPr>
                   <pic:blipFill>
@@ -491,7 +491,7 @@
         <w:tabs>
           <w:tab w:pos="708" w:val="left"/>
         </w:tabs>
-        <w:spacing w:after="200"/>
+        <w:spacing w:after="200" w:before="240"/>
         <w:ind w:left="708" w:hanging="708"/>
         <w:jc w:val="both"/>
       </w:pPr>
@@ -543,7 +543,7 @@
         <w:tabs>
           <w:tab w:pos="708" w:val="left"/>
         </w:tabs>
-        <w:spacing w:after="200"/>
+        <w:spacing w:after="200" w:before="240"/>
         <w:ind w:left="708" w:hanging="708"/>
         <w:jc w:val="both"/>
       </w:pPr>
@@ -750,7 +750,7 @@
         <w:tabs>
           <w:tab w:pos="708" w:val="left"/>
         </w:tabs>
-        <w:spacing w:after="200"/>
+        <w:spacing w:after="200" w:before="240"/>
         <w:ind w:left="708" w:hanging="708"/>
         <w:jc w:val="both"/>
       </w:pPr>
@@ -802,7 +802,7 @@
         <w:tabs>
           <w:tab w:pos="708" w:val="left"/>
         </w:tabs>
-        <w:spacing w:after="200"/>
+        <w:spacing w:after="200" w:before="240"/>
         <w:ind w:left="708" w:hanging="708"/>
         <w:jc w:val="both"/>
       </w:pPr>
@@ -967,7 +967,7 @@
         <w:tabs>
           <w:tab w:pos="708" w:val="left"/>
         </w:tabs>
-        <w:spacing w:after="200"/>
+        <w:spacing w:after="200" w:before="240"/>
         <w:ind w:left="708" w:hanging="708"/>
         <w:jc w:val="both"/>
       </w:pPr>
@@ -2330,7 +2330,7 @@
         <w:tabs>
           <w:tab w:pos="708" w:val="left"/>
         </w:tabs>
-        <w:spacing w:after="200"/>
+        <w:spacing w:after="200" w:before="240"/>
         <w:ind w:left="708" w:hanging="708"/>
         <w:jc w:val="both"/>
       </w:pPr>
@@ -2407,7 +2407,7 @@
         <w:tabs>
           <w:tab w:pos="708" w:val="left"/>
         </w:tabs>
-        <w:spacing w:after="200"/>
+        <w:spacing w:after="200" w:before="240"/>
         <w:ind w:left="708" w:hanging="708"/>
         <w:jc w:val="both"/>
       </w:pPr>
@@ -2484,7 +2484,7 @@
         <w:tabs>
           <w:tab w:pos="708" w:val="left"/>
         </w:tabs>
-        <w:spacing w:after="200"/>
+        <w:spacing w:after="200" w:before="240"/>
         <w:ind w:left="708" w:hanging="708"/>
         <w:jc w:val="both"/>
       </w:pPr>
@@ -2545,7 +2545,7 @@
         <w:tabs>
           <w:tab w:pos="708" w:val="left"/>
         </w:tabs>
-        <w:spacing w:after="200"/>
+        <w:spacing w:after="200" w:before="240"/>
         <w:ind w:left="708" w:hanging="708"/>
         <w:jc w:val="both"/>
       </w:pPr>

</xml_diff>